<commit_message>
Add QuantUI plotting workflow and samples
Introduce a complete handoff from the GPU tutorial into the visualization session: add a CPU geometry-optimization exporter, a plotting notebook plus shared plotting module, and bundled sample QuantUI JSON so the lesson still runs when live jobs are unavailable. The docs and ignore rules are updated to explain the new workflow, save figure outputs cleanly, and record the confirmed workshop GPU allocation. This also vendors the agenda table-width helper locally so the DOCX can be rebuilt on any machine instead of depending on one contributor's absolute path.
</commit_message>
<xml_diff>
--- a/agenda/Agenda_Revised.docx
+++ b/agenda/Agenda_Revised.docx
@@ -46,10 +46,8 @@
     <w:tbl>
       <w:tblPr>
         <w:tblW w:type="dxa" w:w="9360"/>
-        <w:jc w:val="left"/>
         <w:tblLayout w:type="fixed"/>
         <w:tblLook w:firstColumn="1" w:firstRow="1" w:lastColumn="0" w:lastRow="0" w:noHBand="0" w:noVBand="1" w:val="04A0"/>
-        <w:tblInd w:type="dxa" w:w="120"/>
         <w:tblBorders>
           <w:top w:val="single" w:sz="4" w:space="0" w:color="D4DDE7"/>
           <w:left w:val="single" w:sz="4" w:space="0" w:color="D4DDE7"/>
@@ -75,12 +73,6 @@
             <w:tcW w:type="dxa" w:w="2340"/>
             <w:shd w:fill="E8EEF5"/>
             <w:vAlign w:val="center"/>
-            <w:tcMar>
-              <w:top w:w="80" w:type="dxa"/>
-              <w:bottom w:w="80" w:type="dxa"/>
-              <w:start w:w="120" w:type="dxa"/>
-              <w:end w:w="120" w:type="dxa"/>
-            </w:tcMar>
           </w:tcPr>
           <w:p>
             <w:pPr>
@@ -114,12 +106,6 @@
             <w:tcW w:type="dxa" w:w="2340"/>
             <w:shd w:fill="E8EEF5"/>
             <w:vAlign w:val="center"/>
-            <w:tcMar>
-              <w:top w:w="80" w:type="dxa"/>
-              <w:bottom w:w="80" w:type="dxa"/>
-              <w:start w:w="120" w:type="dxa"/>
-              <w:end w:w="120" w:type="dxa"/>
-            </w:tcMar>
           </w:tcPr>
           <w:p>
             <w:pPr>
@@ -153,12 +139,6 @@
             <w:tcW w:type="dxa" w:w="2340"/>
             <w:shd w:fill="E8EEF5"/>
             <w:vAlign w:val="center"/>
-            <w:tcMar>
-              <w:top w:w="80" w:type="dxa"/>
-              <w:bottom w:w="80" w:type="dxa"/>
-              <w:start w:w="120" w:type="dxa"/>
-              <w:end w:w="120" w:type="dxa"/>
-            </w:tcMar>
           </w:tcPr>
           <w:p>
             <w:pPr>
@@ -192,12 +172,6 @@
             <w:tcW w:type="dxa" w:w="2340"/>
             <w:shd w:fill="E8EEF5"/>
             <w:vAlign w:val="center"/>
-            <w:tcMar>
-              <w:top w:w="80" w:type="dxa"/>
-              <w:bottom w:w="80" w:type="dxa"/>
-              <w:start w:w="120" w:type="dxa"/>
-              <w:end w:w="120" w:type="dxa"/>
-            </w:tcMar>
           </w:tcPr>
           <w:p>
             <w:pPr>
@@ -453,10 +427,8 @@
     <w:tbl>
       <w:tblPr>
         <w:tblW w:type="dxa" w:w="9360"/>
-        <w:jc w:val="left"/>
         <w:tblLayout w:type="fixed"/>
         <w:tblLook w:firstColumn="1" w:firstRow="1" w:lastColumn="0" w:lastRow="0" w:noHBand="0" w:noVBand="1" w:val="04A0"/>
-        <w:tblInd w:type="dxa" w:w="120"/>
         <w:tblBorders>
           <w:top w:val="single" w:sz="6" w:space="0" w:color="B8C4D1"/>
           <w:left w:val="single" w:sz="6" w:space="0" w:color="B8C4D1"/>
@@ -481,12 +453,6 @@
             <w:tcW w:type="dxa" w:w="1680"/>
             <w:shd w:fill="E8EEF5"/>
             <w:vAlign w:val="center"/>
-            <w:tcMar>
-              <w:top w:w="80" w:type="dxa"/>
-              <w:bottom w:w="80" w:type="dxa"/>
-              <w:start w:w="120" w:type="dxa"/>
-              <w:end w:w="120" w:type="dxa"/>
-            </w:tcMar>
           </w:tcPr>
           <w:p>
             <w:pPr>
@@ -509,12 +475,6 @@
             <w:tcW w:type="dxa" w:w="3180"/>
             <w:shd w:fill="E8EEF5"/>
             <w:vAlign w:val="center"/>
-            <w:tcMar>
-              <w:top w:w="80" w:type="dxa"/>
-              <w:bottom w:w="80" w:type="dxa"/>
-              <w:start w:w="120" w:type="dxa"/>
-              <w:end w:w="120" w:type="dxa"/>
-            </w:tcMar>
           </w:tcPr>
           <w:p>
             <w:pPr>
@@ -537,12 +497,6 @@
             <w:tcW w:type="dxa" w:w="4500"/>
             <w:shd w:fill="E8EEF5"/>
             <w:vAlign w:val="center"/>
-            <w:tcMar>
-              <w:top w:w="80" w:type="dxa"/>
-              <w:bottom w:w="80" w:type="dxa"/>
-              <w:start w:w="120" w:type="dxa"/>
-              <w:end w:w="120" w:type="dxa"/>
-            </w:tcMar>
           </w:tcPr>
           <w:p>
             <w:pPr>
@@ -569,12 +523,6 @@
           <w:tcPr>
             <w:tcW w:type="dxa" w:w="1680"/>
             <w:vAlign w:val="center"/>
-            <w:tcMar>
-              <w:top w:w="80" w:type="dxa"/>
-              <w:bottom w:w="80" w:type="dxa"/>
-              <w:start w:w="120" w:type="dxa"/>
-              <w:end w:w="120" w:type="dxa"/>
-            </w:tcMar>
           </w:tcPr>
           <w:p>
             <w:pPr>
@@ -596,12 +544,6 @@
           <w:tcPr>
             <w:tcW w:type="dxa" w:w="3180"/>
             <w:vAlign w:val="center"/>
-            <w:tcMar>
-              <w:top w:w="80" w:type="dxa"/>
-              <w:bottom w:w="80" w:type="dxa"/>
-              <w:start w:w="120" w:type="dxa"/>
-              <w:end w:w="120" w:type="dxa"/>
-            </w:tcMar>
           </w:tcPr>
           <w:p>
             <w:pPr>
@@ -623,12 +565,6 @@
           <w:tcPr>
             <w:tcW w:type="dxa" w:w="4500"/>
             <w:vAlign w:val="center"/>
-            <w:tcMar>
-              <w:top w:w="80" w:type="dxa"/>
-              <w:bottom w:w="80" w:type="dxa"/>
-              <w:start w:w="120" w:type="dxa"/>
-              <w:end w:w="120" w:type="dxa"/>
-            </w:tcMar>
           </w:tcPr>
           <w:p>
             <w:pPr>
@@ -655,12 +591,6 @@
           <w:tcPr>
             <w:tcW w:type="dxa" w:w="1680"/>
             <w:vAlign w:val="center"/>
-            <w:tcMar>
-              <w:top w:w="80" w:type="dxa"/>
-              <w:bottom w:w="80" w:type="dxa"/>
-              <w:start w:w="120" w:type="dxa"/>
-              <w:end w:w="120" w:type="dxa"/>
-            </w:tcMar>
           </w:tcPr>
           <w:p>
             <w:pPr>
@@ -682,12 +612,6 @@
           <w:tcPr>
             <w:tcW w:type="dxa" w:w="3180"/>
             <w:vAlign w:val="center"/>
-            <w:tcMar>
-              <w:top w:w="80" w:type="dxa"/>
-              <w:bottom w:w="80" w:type="dxa"/>
-              <w:start w:w="120" w:type="dxa"/>
-              <w:end w:w="120" w:type="dxa"/>
-            </w:tcMar>
           </w:tcPr>
           <w:p>
             <w:pPr>
@@ -709,12 +633,6 @@
           <w:tcPr>
             <w:tcW w:type="dxa" w:w="4500"/>
             <w:vAlign w:val="center"/>
-            <w:tcMar>
-              <w:top w:w="80" w:type="dxa"/>
-              <w:bottom w:w="80" w:type="dxa"/>
-              <w:start w:w="120" w:type="dxa"/>
-              <w:end w:w="120" w:type="dxa"/>
-            </w:tcMar>
           </w:tcPr>
           <w:p>
             <w:pPr>
@@ -741,12 +659,6 @@
           <w:tcPr>
             <w:tcW w:type="dxa" w:w="1680"/>
             <w:vAlign w:val="center"/>
-            <w:tcMar>
-              <w:top w:w="80" w:type="dxa"/>
-              <w:bottom w:w="80" w:type="dxa"/>
-              <w:start w:w="120" w:type="dxa"/>
-              <w:end w:w="120" w:type="dxa"/>
-            </w:tcMar>
           </w:tcPr>
           <w:p>
             <w:pPr>
@@ -768,12 +680,6 @@
           <w:tcPr>
             <w:tcW w:type="dxa" w:w="3180"/>
             <w:vAlign w:val="center"/>
-            <w:tcMar>
-              <w:top w:w="80" w:type="dxa"/>
-              <w:bottom w:w="80" w:type="dxa"/>
-              <w:start w:w="120" w:type="dxa"/>
-              <w:end w:w="120" w:type="dxa"/>
-            </w:tcMar>
           </w:tcPr>
           <w:p>
             <w:pPr>
@@ -795,12 +701,6 @@
           <w:tcPr>
             <w:tcW w:type="dxa" w:w="4500"/>
             <w:vAlign w:val="center"/>
-            <w:tcMar>
-              <w:top w:w="80" w:type="dxa"/>
-              <w:bottom w:w="80" w:type="dxa"/>
-              <w:start w:w="120" w:type="dxa"/>
-              <w:end w:w="120" w:type="dxa"/>
-            </w:tcMar>
           </w:tcPr>
           <w:p>
             <w:pPr>
@@ -828,12 +728,6 @@
             <w:tcW w:type="dxa" w:w="1680"/>
             <w:vAlign w:val="center"/>
             <w:shd w:fill="F2F4F7"/>
-            <w:tcMar>
-              <w:top w:w="80" w:type="dxa"/>
-              <w:bottom w:w="80" w:type="dxa"/>
-              <w:start w:w="120" w:type="dxa"/>
-              <w:end w:w="120" w:type="dxa"/>
-            </w:tcMar>
           </w:tcPr>
           <w:p>
             <w:pPr>
@@ -856,12 +750,6 @@
             <w:tcW w:type="dxa" w:w="3180"/>
             <w:vAlign w:val="center"/>
             <w:shd w:fill="F2F4F7"/>
-            <w:tcMar>
-              <w:top w:w="80" w:type="dxa"/>
-              <w:bottom w:w="80" w:type="dxa"/>
-              <w:start w:w="120" w:type="dxa"/>
-              <w:end w:w="120" w:type="dxa"/>
-            </w:tcMar>
           </w:tcPr>
           <w:p>
             <w:pPr>
@@ -884,12 +772,6 @@
             <w:tcW w:type="dxa" w:w="4500"/>
             <w:vAlign w:val="center"/>
             <w:shd w:fill="F2F4F7"/>
-            <w:tcMar>
-              <w:top w:w="80" w:type="dxa"/>
-              <w:bottom w:w="80" w:type="dxa"/>
-              <w:start w:w="120" w:type="dxa"/>
-              <w:end w:w="120" w:type="dxa"/>
-            </w:tcMar>
           </w:tcPr>
           <w:p>
             <w:pPr>
@@ -915,12 +797,6 @@
           <w:tcPr>
             <w:tcW w:type="dxa" w:w="1680"/>
             <w:vAlign w:val="center"/>
-            <w:tcMar>
-              <w:top w:w="80" w:type="dxa"/>
-              <w:bottom w:w="80" w:type="dxa"/>
-              <w:start w:w="120" w:type="dxa"/>
-              <w:end w:w="120" w:type="dxa"/>
-            </w:tcMar>
           </w:tcPr>
           <w:p>
             <w:pPr>
@@ -942,12 +818,6 @@
           <w:tcPr>
             <w:tcW w:type="dxa" w:w="3180"/>
             <w:vAlign w:val="center"/>
-            <w:tcMar>
-              <w:top w:w="80" w:type="dxa"/>
-              <w:bottom w:w="80" w:type="dxa"/>
-              <w:start w:w="120" w:type="dxa"/>
-              <w:end w:w="120" w:type="dxa"/>
-            </w:tcMar>
           </w:tcPr>
           <w:p>
             <w:pPr>
@@ -969,12 +839,6 @@
           <w:tcPr>
             <w:tcW w:type="dxa" w:w="4500"/>
             <w:vAlign w:val="center"/>
-            <w:tcMar>
-              <w:top w:w="80" w:type="dxa"/>
-              <w:bottom w:w="80" w:type="dxa"/>
-              <w:start w:w="120" w:type="dxa"/>
-              <w:end w:w="120" w:type="dxa"/>
-            </w:tcMar>
           </w:tcPr>
           <w:p>
             <w:pPr>
@@ -1001,12 +865,6 @@
           <w:tcPr>
             <w:tcW w:type="dxa" w:w="1680"/>
             <w:vAlign w:val="center"/>
-            <w:tcMar>
-              <w:top w:w="80" w:type="dxa"/>
-              <w:bottom w:w="80" w:type="dxa"/>
-              <w:start w:w="120" w:type="dxa"/>
-              <w:end w:w="120" w:type="dxa"/>
-            </w:tcMar>
           </w:tcPr>
           <w:p>
             <w:pPr>
@@ -1028,12 +886,6 @@
           <w:tcPr>
             <w:tcW w:type="dxa" w:w="3180"/>
             <w:vAlign w:val="center"/>
-            <w:tcMar>
-              <w:top w:w="80" w:type="dxa"/>
-              <w:bottom w:w="80" w:type="dxa"/>
-              <w:start w:w="120" w:type="dxa"/>
-              <w:end w:w="120" w:type="dxa"/>
-            </w:tcMar>
           </w:tcPr>
           <w:p>
             <w:pPr>
@@ -1055,12 +907,6 @@
           <w:tcPr>
             <w:tcW w:type="dxa" w:w="4500"/>
             <w:vAlign w:val="center"/>
-            <w:tcMar>
-              <w:top w:w="80" w:type="dxa"/>
-              <w:bottom w:w="80" w:type="dxa"/>
-              <w:start w:w="120" w:type="dxa"/>
-              <w:end w:w="120" w:type="dxa"/>
-            </w:tcMar>
           </w:tcPr>
           <w:p>
             <w:pPr>
@@ -1088,12 +934,6 @@
             <w:tcW w:type="dxa" w:w="1680"/>
             <w:vAlign w:val="center"/>
             <w:shd w:fill="F2F4F7"/>
-            <w:tcMar>
-              <w:top w:w="80" w:type="dxa"/>
-              <w:bottom w:w="80" w:type="dxa"/>
-              <w:start w:w="120" w:type="dxa"/>
-              <w:end w:w="120" w:type="dxa"/>
-            </w:tcMar>
           </w:tcPr>
           <w:p>
             <w:pPr>
@@ -1116,12 +956,6 @@
             <w:tcW w:type="dxa" w:w="3180"/>
             <w:vAlign w:val="center"/>
             <w:shd w:fill="F2F4F7"/>
-            <w:tcMar>
-              <w:top w:w="80" w:type="dxa"/>
-              <w:bottom w:w="80" w:type="dxa"/>
-              <w:start w:w="120" w:type="dxa"/>
-              <w:end w:w="120" w:type="dxa"/>
-            </w:tcMar>
           </w:tcPr>
           <w:p>
             <w:pPr>
@@ -1144,12 +978,6 @@
             <w:tcW w:type="dxa" w:w="4500"/>
             <w:vAlign w:val="center"/>
             <w:shd w:fill="F2F4F7"/>
-            <w:tcMar>
-              <w:top w:w="80" w:type="dxa"/>
-              <w:bottom w:w="80" w:type="dxa"/>
-              <w:start w:w="120" w:type="dxa"/>
-              <w:end w:w="120" w:type="dxa"/>
-            </w:tcMar>
           </w:tcPr>
           <w:p>
             <w:pPr>
@@ -1175,12 +1003,6 @@
           <w:tcPr>
             <w:tcW w:type="dxa" w:w="1680"/>
             <w:vAlign w:val="center"/>
-            <w:tcMar>
-              <w:top w:w="80" w:type="dxa"/>
-              <w:bottom w:w="80" w:type="dxa"/>
-              <w:start w:w="120" w:type="dxa"/>
-              <w:end w:w="120" w:type="dxa"/>
-            </w:tcMar>
           </w:tcPr>
           <w:p>
             <w:pPr>
@@ -1202,12 +1024,6 @@
           <w:tcPr>
             <w:tcW w:type="dxa" w:w="3180"/>
             <w:vAlign w:val="center"/>
-            <w:tcMar>
-              <w:top w:w="80" w:type="dxa"/>
-              <w:bottom w:w="80" w:type="dxa"/>
-              <w:start w:w="120" w:type="dxa"/>
-              <w:end w:w="120" w:type="dxa"/>
-            </w:tcMar>
           </w:tcPr>
           <w:p>
             <w:pPr>
@@ -1229,12 +1045,6 @@
           <w:tcPr>
             <w:tcW w:type="dxa" w:w="4500"/>
             <w:vAlign w:val="center"/>
-            <w:tcMar>
-              <w:top w:w="80" w:type="dxa"/>
-              <w:bottom w:w="80" w:type="dxa"/>
-              <w:start w:w="120" w:type="dxa"/>
-              <w:end w:w="120" w:type="dxa"/>
-            </w:tcMar>
           </w:tcPr>
           <w:p>
             <w:pPr>
@@ -1261,12 +1071,6 @@
           <w:tcPr>
             <w:tcW w:type="dxa" w:w="1680"/>
             <w:vAlign w:val="center"/>
-            <w:tcMar>
-              <w:top w:w="80" w:type="dxa"/>
-              <w:bottom w:w="80" w:type="dxa"/>
-              <w:start w:w="120" w:type="dxa"/>
-              <w:end w:w="120" w:type="dxa"/>
-            </w:tcMar>
           </w:tcPr>
           <w:p>
             <w:pPr>
@@ -1288,12 +1092,6 @@
           <w:tcPr>
             <w:tcW w:type="dxa" w:w="3180"/>
             <w:vAlign w:val="center"/>
-            <w:tcMar>
-              <w:top w:w="80" w:type="dxa"/>
-              <w:bottom w:w="80" w:type="dxa"/>
-              <w:start w:w="120" w:type="dxa"/>
-              <w:end w:w="120" w:type="dxa"/>
-            </w:tcMar>
           </w:tcPr>
           <w:p>
             <w:pPr>
@@ -1315,12 +1113,6 @@
           <w:tcPr>
             <w:tcW w:type="dxa" w:w="4500"/>
             <w:vAlign w:val="center"/>
-            <w:tcMar>
-              <w:top w:w="80" w:type="dxa"/>
-              <w:bottom w:w="80" w:type="dxa"/>
-              <w:start w:w="120" w:type="dxa"/>
-              <w:end w:w="120" w:type="dxa"/>
-            </w:tcMar>
           </w:tcPr>
           <w:p>
             <w:pPr>
@@ -1348,12 +1140,6 @@
             <w:tcW w:type="dxa" w:w="1680"/>
             <w:vAlign w:val="center"/>
             <w:shd w:fill="F2F4F7"/>
-            <w:tcMar>
-              <w:top w:w="80" w:type="dxa"/>
-              <w:bottom w:w="80" w:type="dxa"/>
-              <w:start w:w="120" w:type="dxa"/>
-              <w:end w:w="120" w:type="dxa"/>
-            </w:tcMar>
           </w:tcPr>
           <w:p>
             <w:pPr>
@@ -1376,12 +1162,6 @@
             <w:tcW w:type="dxa" w:w="3180"/>
             <w:vAlign w:val="center"/>
             <w:shd w:fill="F2F4F7"/>
-            <w:tcMar>
-              <w:top w:w="80" w:type="dxa"/>
-              <w:bottom w:w="80" w:type="dxa"/>
-              <w:start w:w="120" w:type="dxa"/>
-              <w:end w:w="120" w:type="dxa"/>
-            </w:tcMar>
           </w:tcPr>
           <w:p>
             <w:pPr>
@@ -1404,12 +1184,6 @@
             <w:tcW w:type="dxa" w:w="4500"/>
             <w:vAlign w:val="center"/>
             <w:shd w:fill="F2F4F7"/>
-            <w:tcMar>
-              <w:top w:w="80" w:type="dxa"/>
-              <w:bottom w:w="80" w:type="dxa"/>
-              <w:start w:w="120" w:type="dxa"/>
-              <w:end w:w="120" w:type="dxa"/>
-            </w:tcMar>
           </w:tcPr>
           <w:p>
             <w:pPr>
@@ -1435,12 +1209,6 @@
           <w:tcPr>
             <w:tcW w:type="dxa" w:w="1680"/>
             <w:vAlign w:val="center"/>
-            <w:tcMar>
-              <w:top w:w="80" w:type="dxa"/>
-              <w:bottom w:w="80" w:type="dxa"/>
-              <w:start w:w="120" w:type="dxa"/>
-              <w:end w:w="120" w:type="dxa"/>
-            </w:tcMar>
           </w:tcPr>
           <w:p>
             <w:pPr>
@@ -1454,7 +1222,7 @@
                 <w:color w:val="1F4D78"/>
                 <w:sz w:val="18"/>
               </w:rPr>
-              <w:t>2:30-3:15</w:t>
+              <w:t>2:30-3:30</w:t>
             </w:r>
           </w:p>
         </w:tc>
@@ -1462,12 +1230,6 @@
           <w:tcPr>
             <w:tcW w:type="dxa" w:w="3180"/>
             <w:vAlign w:val="center"/>
-            <w:tcMar>
-              <w:top w:w="80" w:type="dxa"/>
-              <w:bottom w:w="80" w:type="dxa"/>
-              <w:start w:w="120" w:type="dxa"/>
-              <w:end w:w="120" w:type="dxa"/>
-            </w:tcMar>
           </w:tcPr>
           <w:p>
             <w:pPr>
@@ -1489,12 +1251,6 @@
           <w:tcPr>
             <w:tcW w:type="dxa" w:w="4500"/>
             <w:vAlign w:val="center"/>
-            <w:tcMar>
-              <w:top w:w="80" w:type="dxa"/>
-              <w:bottom w:w="80" w:type="dxa"/>
-              <w:start w:w="120" w:type="dxa"/>
-              <w:end w:w="120" w:type="dxa"/>
-            </w:tcMar>
           </w:tcPr>
           <w:p>
             <w:pPr>
@@ -1508,7 +1264,7 @@
                 <w:color w:val="2F3337"/>
                 <w:sz w:val="18"/>
               </w:rPr>
-              <w:t>Verified GPU-offload result</w:t>
+              <w:t>Verified GPU-offload result plus a measured CPU/GPU crossover</w:t>
             </w:r>
           </w:p>
         </w:tc>
@@ -1521,98 +1277,6 @@
           <w:tcPr>
             <w:tcW w:type="dxa" w:w="1680"/>
             <w:vAlign w:val="center"/>
-            <w:tcMar>
-              <w:top w:w="80" w:type="dxa"/>
-              <w:bottom w:w="80" w:type="dxa"/>
-              <w:start w:w="120" w:type="dxa"/>
-              <w:end w:w="120" w:type="dxa"/>
-            </w:tcMar>
-          </w:tcPr>
-          <w:p>
-            <w:pPr>
-              <w:spacing w:before="0" w:after="0" w:line="276" w:lineRule="auto"/>
-            </w:pPr>
-            <w:r/>
-            <w:r>
-              <w:rPr>
-                <w:rFonts w:ascii="Calibri" w:hAnsi="Calibri"/>
-                <w:b/>
-                <w:color w:val="1F4D78"/>
-                <w:sz w:val="18"/>
-              </w:rPr>
-              <w:t>3:15-3:30</w:t>
-            </w:r>
-          </w:p>
-        </w:tc>
-        <w:tc>
-          <w:tcPr>
-            <w:tcW w:type="dxa" w:w="3180"/>
-            <w:vAlign w:val="center"/>
-            <w:tcMar>
-              <w:top w:w="80" w:type="dxa"/>
-              <w:bottom w:w="80" w:type="dxa"/>
-              <w:start w:w="120" w:type="dxa"/>
-              <w:end w:w="120" w:type="dxa"/>
-            </w:tcMar>
-          </w:tcPr>
-          <w:p>
-            <w:pPr>
-              <w:spacing w:before="0" w:after="0" w:line="276" w:lineRule="auto"/>
-            </w:pPr>
-            <w:r/>
-            <w:r>
-              <w:rPr>
-                <w:rFonts w:ascii="Calibri" w:hAnsi="Calibri"/>
-                <w:b w:val="0"/>
-                <w:color w:val="2F3337"/>
-                <w:sz w:val="18"/>
-              </w:rPr>
-              <w:t>CPU/GPU comparison</w:t>
-            </w:r>
-          </w:p>
-        </w:tc>
-        <w:tc>
-          <w:tcPr>
-            <w:tcW w:type="dxa" w:w="4500"/>
-            <w:vAlign w:val="center"/>
-            <w:tcMar>
-              <w:top w:w="80" w:type="dxa"/>
-              <w:bottom w:w="80" w:type="dxa"/>
-              <w:start w:w="120" w:type="dxa"/>
-              <w:end w:w="120" w:type="dxa"/>
-            </w:tcMar>
-          </w:tcPr>
-          <w:p>
-            <w:pPr>
-              <w:spacing w:before="0" w:after="0" w:line="276" w:lineRule="auto"/>
-            </w:pPr>
-            <w:r/>
-            <w:r>
-              <w:rPr>
-                <w:rFonts w:ascii="Calibri" w:hAnsi="Calibri"/>
-                <w:b w:val="0"/>
-                <w:color w:val="2F3337"/>
-                <w:sz w:val="18"/>
-              </w:rPr>
-              <w:t>Resource/environment boundary</w:t>
-            </w:r>
-          </w:p>
-        </w:tc>
-      </w:tr>
-      <w:tr>
-        <w:trPr>
-          <w:cantSplit w:val="true"/>
-        </w:trPr>
-        <w:tc>
-          <w:tcPr>
-            <w:tcW w:type="dxa" w:w="1680"/>
-            <w:vAlign w:val="center"/>
-            <w:tcMar>
-              <w:top w:w="80" w:type="dxa"/>
-              <w:bottom w:w="80" w:type="dxa"/>
-              <w:start w:w="120" w:type="dxa"/>
-              <w:end w:w="120" w:type="dxa"/>
-            </w:tcMar>
           </w:tcPr>
           <w:p>
             <w:pPr>
@@ -1634,12 +1298,6 @@
           <w:tcPr>
             <w:tcW w:type="dxa" w:w="3180"/>
             <w:vAlign w:val="center"/>
-            <w:tcMar>
-              <w:top w:w="80" w:type="dxa"/>
-              <w:bottom w:w="80" w:type="dxa"/>
-              <w:start w:w="120" w:type="dxa"/>
-              <w:end w:w="120" w:type="dxa"/>
-            </w:tcMar>
           </w:tcPr>
           <w:p>
             <w:pPr>
@@ -1661,12 +1319,6 @@
           <w:tcPr>
             <w:tcW w:type="dxa" w:w="4500"/>
             <w:vAlign w:val="center"/>
-            <w:tcMar>
-              <w:top w:w="80" w:type="dxa"/>
-              <w:bottom w:w="80" w:type="dxa"/>
-              <w:start w:w="120" w:type="dxa"/>
-              <w:end w:w="120" w:type="dxa"/>
-            </w:tcMar>
           </w:tcPr>
           <w:p>
             <w:pPr>
@@ -1693,12 +1345,6 @@
           <w:tcPr>
             <w:tcW w:type="dxa" w:w="1680"/>
             <w:vAlign w:val="center"/>
-            <w:tcMar>
-              <w:top w:w="80" w:type="dxa"/>
-              <w:bottom w:w="80" w:type="dxa"/>
-              <w:start w:w="120" w:type="dxa"/>
-              <w:end w:w="120" w:type="dxa"/>
-            </w:tcMar>
           </w:tcPr>
           <w:p>
             <w:pPr>
@@ -1720,12 +1366,6 @@
           <w:tcPr>
             <w:tcW w:type="dxa" w:w="3180"/>
             <w:vAlign w:val="center"/>
-            <w:tcMar>
-              <w:top w:w="80" w:type="dxa"/>
-              <w:bottom w:w="80" w:type="dxa"/>
-              <w:start w:w="120" w:type="dxa"/>
-              <w:end w:w="120" w:type="dxa"/>
-            </w:tcMar>
           </w:tcPr>
           <w:p>
             <w:pPr>
@@ -1747,12 +1387,6 @@
           <w:tcPr>
             <w:tcW w:type="dxa" w:w="4500"/>
             <w:vAlign w:val="center"/>
-            <w:tcMar>
-              <w:top w:w="80" w:type="dxa"/>
-              <w:bottom w:w="80" w:type="dxa"/>
-              <w:start w:w="120" w:type="dxa"/>
-              <w:end w:w="120" w:type="dxa"/>
-            </w:tcMar>
           </w:tcPr>
           <w:p>
             <w:pPr>
@@ -1797,10 +1431,8 @@
     <w:tbl>
       <w:tblPr>
         <w:tblW w:type="dxa" w:w="9360"/>
-        <w:jc w:val="left"/>
         <w:tblLayout w:type="fixed"/>
         <w:tblLook w:firstColumn="1" w:firstRow="1" w:lastColumn="0" w:lastRow="0" w:noHBand="0" w:noVBand="1" w:val="04A0"/>
-        <w:tblInd w:type="dxa" w:w="120"/>
         <w:tblBorders>
           <w:top w:val="single" w:sz="6" w:space="0" w:color="B8C4D1"/>
           <w:left w:val="single" w:sz="6" w:space="0" w:color="B8C4D1"/>
@@ -1825,12 +1457,6 @@
             <w:tcW w:type="dxa" w:w="1500"/>
             <w:shd w:fill="E8EEF5"/>
             <w:vAlign w:val="center"/>
-            <w:tcMar>
-              <w:top w:w="80" w:type="dxa"/>
-              <w:bottom w:w="80" w:type="dxa"/>
-              <w:start w:w="120" w:type="dxa"/>
-              <w:end w:w="120" w:type="dxa"/>
-            </w:tcMar>
           </w:tcPr>
           <w:p>
             <w:pPr>
@@ -1853,12 +1479,6 @@
             <w:tcW w:type="dxa" w:w="4650"/>
             <w:shd w:fill="E8EEF5"/>
             <w:vAlign w:val="center"/>
-            <w:tcMar>
-              <w:top w:w="80" w:type="dxa"/>
-              <w:bottom w:w="80" w:type="dxa"/>
-              <w:start w:w="120" w:type="dxa"/>
-              <w:end w:w="120" w:type="dxa"/>
-            </w:tcMar>
           </w:tcPr>
           <w:p>
             <w:pPr>
@@ -1881,12 +1501,6 @@
             <w:tcW w:type="dxa" w:w="3210"/>
             <w:shd w:fill="E8EEF5"/>
             <w:vAlign w:val="center"/>
-            <w:tcMar>
-              <w:top w:w="80" w:type="dxa"/>
-              <w:bottom w:w="80" w:type="dxa"/>
-              <w:start w:w="120" w:type="dxa"/>
-              <w:end w:w="120" w:type="dxa"/>
-            </w:tcMar>
           </w:tcPr>
           <w:p>
             <w:pPr>
@@ -1913,12 +1527,6 @@
           <w:tcPr>
             <w:tcW w:type="dxa" w:w="1500"/>
             <w:vAlign w:val="center"/>
-            <w:tcMar>
-              <w:top w:w="80" w:type="dxa"/>
-              <w:bottom w:w="80" w:type="dxa"/>
-              <w:start w:w="120" w:type="dxa"/>
-              <w:end w:w="120" w:type="dxa"/>
-            </w:tcMar>
           </w:tcPr>
           <w:p>
             <w:pPr>
@@ -1940,12 +1548,6 @@
           <w:tcPr>
             <w:tcW w:type="dxa" w:w="4650"/>
             <w:vAlign w:val="center"/>
-            <w:tcMar>
-              <w:top w:w="80" w:type="dxa"/>
-              <w:bottom w:w="80" w:type="dxa"/>
-              <w:start w:w="120" w:type="dxa"/>
-              <w:end w:w="120" w:type="dxa"/>
-            </w:tcMar>
           </w:tcPr>
           <w:p>
             <w:pPr>
@@ -1967,12 +1569,6 @@
           <w:tcPr>
             <w:tcW w:type="dxa" w:w="3210"/>
             <w:vAlign w:val="center"/>
-            <w:tcMar>
-              <w:top w:w="80" w:type="dxa"/>
-              <w:bottom w:w="80" w:type="dxa"/>
-              <w:start w:w="120" w:type="dxa"/>
-              <w:end w:w="120" w:type="dxa"/>
-            </w:tcMar>
           </w:tcPr>
           <w:p>
             <w:pPr>
@@ -1999,12 +1595,6 @@
           <w:tcPr>
             <w:tcW w:type="dxa" w:w="1500"/>
             <w:vAlign w:val="center"/>
-            <w:tcMar>
-              <w:top w:w="80" w:type="dxa"/>
-              <w:bottom w:w="80" w:type="dxa"/>
-              <w:start w:w="120" w:type="dxa"/>
-              <w:end w:w="120" w:type="dxa"/>
-            </w:tcMar>
           </w:tcPr>
           <w:p>
             <w:pPr>
@@ -2026,12 +1616,6 @@
           <w:tcPr>
             <w:tcW w:type="dxa" w:w="4650"/>
             <w:vAlign w:val="center"/>
-            <w:tcMar>
-              <w:top w:w="80" w:type="dxa"/>
-              <w:bottom w:w="80" w:type="dxa"/>
-              <w:start w:w="120" w:type="dxa"/>
-              <w:end w:w="120" w:type="dxa"/>
-            </w:tcMar>
           </w:tcPr>
           <w:p>
             <w:pPr>
@@ -2053,12 +1637,6 @@
           <w:tcPr>
             <w:tcW w:type="dxa" w:w="3210"/>
             <w:vAlign w:val="center"/>
-            <w:tcMar>
-              <w:top w:w="80" w:type="dxa"/>
-              <w:bottom w:w="80" w:type="dxa"/>
-              <w:start w:w="120" w:type="dxa"/>
-              <w:end w:w="120" w:type="dxa"/>
-            </w:tcMar>
           </w:tcPr>
           <w:p>
             <w:pPr>
@@ -2085,12 +1663,6 @@
           <w:tcPr>
             <w:tcW w:type="dxa" w:w="1500"/>
             <w:vAlign w:val="center"/>
-            <w:tcMar>
-              <w:top w:w="80" w:type="dxa"/>
-              <w:bottom w:w="80" w:type="dxa"/>
-              <w:start w:w="120" w:type="dxa"/>
-              <w:end w:w="120" w:type="dxa"/>
-            </w:tcMar>
           </w:tcPr>
           <w:p>
             <w:pPr>
@@ -2112,12 +1684,6 @@
           <w:tcPr>
             <w:tcW w:type="dxa" w:w="4650"/>
             <w:vAlign w:val="center"/>
-            <w:tcMar>
-              <w:top w:w="80" w:type="dxa"/>
-              <w:bottom w:w="80" w:type="dxa"/>
-              <w:start w:w="120" w:type="dxa"/>
-              <w:end w:w="120" w:type="dxa"/>
-            </w:tcMar>
           </w:tcPr>
           <w:p>
             <w:pPr>
@@ -2139,12 +1705,6 @@
           <w:tcPr>
             <w:tcW w:type="dxa" w:w="3210"/>
             <w:vAlign w:val="center"/>
-            <w:tcMar>
-              <w:top w:w="80" w:type="dxa"/>
-              <w:bottom w:w="80" w:type="dxa"/>
-              <w:start w:w="120" w:type="dxa"/>
-              <w:end w:w="120" w:type="dxa"/>
-            </w:tcMar>
           </w:tcPr>
           <w:p>
             <w:pPr>
@@ -2171,12 +1731,6 @@
           <w:tcPr>
             <w:tcW w:type="dxa" w:w="1500"/>
             <w:vAlign w:val="center"/>
-            <w:tcMar>
-              <w:top w:w="80" w:type="dxa"/>
-              <w:bottom w:w="80" w:type="dxa"/>
-              <w:start w:w="120" w:type="dxa"/>
-              <w:end w:w="120" w:type="dxa"/>
-            </w:tcMar>
           </w:tcPr>
           <w:p>
             <w:pPr>
@@ -2198,12 +1752,6 @@
           <w:tcPr>
             <w:tcW w:type="dxa" w:w="4650"/>
             <w:vAlign w:val="center"/>
-            <w:tcMar>
-              <w:top w:w="80" w:type="dxa"/>
-              <w:bottom w:w="80" w:type="dxa"/>
-              <w:start w:w="120" w:type="dxa"/>
-              <w:end w:w="120" w:type="dxa"/>
-            </w:tcMar>
           </w:tcPr>
           <w:p>
             <w:pPr>
@@ -2225,12 +1773,6 @@
           <w:tcPr>
             <w:tcW w:type="dxa" w:w="3210"/>
             <w:vAlign w:val="center"/>
-            <w:tcMar>
-              <w:top w:w="80" w:type="dxa"/>
-              <w:bottom w:w="80" w:type="dxa"/>
-              <w:start w:w="120" w:type="dxa"/>
-              <w:end w:w="120" w:type="dxa"/>
-            </w:tcMar>
           </w:tcPr>
           <w:p>
             <w:pPr>
@@ -2258,12 +1800,6 @@
             <w:tcW w:type="dxa" w:w="1500"/>
             <w:vAlign w:val="center"/>
             <w:shd w:fill="F2F4F7"/>
-            <w:tcMar>
-              <w:top w:w="80" w:type="dxa"/>
-              <w:bottom w:w="80" w:type="dxa"/>
-              <w:start w:w="120" w:type="dxa"/>
-              <w:end w:w="120" w:type="dxa"/>
-            </w:tcMar>
           </w:tcPr>
           <w:p>
             <w:pPr>
@@ -2286,12 +1822,6 @@
             <w:tcW w:type="dxa" w:w="4650"/>
             <w:vAlign w:val="center"/>
             <w:shd w:fill="F2F4F7"/>
-            <w:tcMar>
-              <w:top w:w="80" w:type="dxa"/>
-              <w:bottom w:w="80" w:type="dxa"/>
-              <w:start w:w="120" w:type="dxa"/>
-              <w:end w:w="120" w:type="dxa"/>
-            </w:tcMar>
           </w:tcPr>
           <w:p>
             <w:pPr>
@@ -2314,12 +1844,6 @@
             <w:tcW w:type="dxa" w:w="3210"/>
             <w:vAlign w:val="center"/>
             <w:shd w:fill="F2F4F7"/>
-            <w:tcMar>
-              <w:top w:w="80" w:type="dxa"/>
-              <w:bottom w:w="80" w:type="dxa"/>
-              <w:start w:w="120" w:type="dxa"/>
-              <w:end w:w="120" w:type="dxa"/>
-            </w:tcMar>
           </w:tcPr>
           <w:p>
             <w:pPr>
@@ -2345,12 +1869,6 @@
           <w:tcPr>
             <w:tcW w:type="dxa" w:w="1500"/>
             <w:vAlign w:val="center"/>
-            <w:tcMar>
-              <w:top w:w="80" w:type="dxa"/>
-              <w:bottom w:w="80" w:type="dxa"/>
-              <w:start w:w="120" w:type="dxa"/>
-              <w:end w:w="120" w:type="dxa"/>
-            </w:tcMar>
           </w:tcPr>
           <w:p>
             <w:pPr>
@@ -2372,12 +1890,6 @@
           <w:tcPr>
             <w:tcW w:type="dxa" w:w="4650"/>
             <w:vAlign w:val="center"/>
-            <w:tcMar>
-              <w:top w:w="80" w:type="dxa"/>
-              <w:bottom w:w="80" w:type="dxa"/>
-              <w:start w:w="120" w:type="dxa"/>
-              <w:end w:w="120" w:type="dxa"/>
-            </w:tcMar>
           </w:tcPr>
           <w:p>
             <w:pPr>
@@ -2399,12 +1911,6 @@
           <w:tcPr>
             <w:tcW w:type="dxa" w:w="3210"/>
             <w:vAlign w:val="center"/>
-            <w:tcMar>
-              <w:top w:w="80" w:type="dxa"/>
-              <w:bottom w:w="80" w:type="dxa"/>
-              <w:start w:w="120" w:type="dxa"/>
-              <w:end w:w="120" w:type="dxa"/>
-            </w:tcMar>
           </w:tcPr>
           <w:p>
             <w:pPr>
@@ -2431,12 +1937,6 @@
           <w:tcPr>
             <w:tcW w:type="dxa" w:w="1500"/>
             <w:vAlign w:val="center"/>
-            <w:tcMar>
-              <w:top w:w="80" w:type="dxa"/>
-              <w:bottom w:w="80" w:type="dxa"/>
-              <w:start w:w="120" w:type="dxa"/>
-              <w:end w:w="120" w:type="dxa"/>
-            </w:tcMar>
           </w:tcPr>
           <w:p>
             <w:pPr>
@@ -2458,12 +1958,6 @@
           <w:tcPr>
             <w:tcW w:type="dxa" w:w="4650"/>
             <w:vAlign w:val="center"/>
-            <w:tcMar>
-              <w:top w:w="80" w:type="dxa"/>
-              <w:bottom w:w="80" w:type="dxa"/>
-              <w:start w:w="120" w:type="dxa"/>
-              <w:end w:w="120" w:type="dxa"/>
-            </w:tcMar>
           </w:tcPr>
           <w:p>
             <w:pPr>
@@ -2485,12 +1979,6 @@
           <w:tcPr>
             <w:tcW w:type="dxa" w:w="3210"/>
             <w:vAlign w:val="center"/>
-            <w:tcMar>
-              <w:top w:w="80" w:type="dxa"/>
-              <w:bottom w:w="80" w:type="dxa"/>
-              <w:start w:w="120" w:type="dxa"/>
-              <w:end w:w="120" w:type="dxa"/>
-            </w:tcMar>
           </w:tcPr>
           <w:p>
             <w:pPr>
@@ -2517,12 +2005,6 @@
           <w:tcPr>
             <w:tcW w:type="dxa" w:w="1500"/>
             <w:vAlign w:val="center"/>
-            <w:tcMar>
-              <w:top w:w="80" w:type="dxa"/>
-              <w:bottom w:w="80" w:type="dxa"/>
-              <w:start w:w="120" w:type="dxa"/>
-              <w:end w:w="120" w:type="dxa"/>
-            </w:tcMar>
           </w:tcPr>
           <w:p>
             <w:pPr>
@@ -2544,12 +2026,6 @@
           <w:tcPr>
             <w:tcW w:type="dxa" w:w="4650"/>
             <w:vAlign w:val="center"/>
-            <w:tcMar>
-              <w:top w:w="80" w:type="dxa"/>
-              <w:bottom w:w="80" w:type="dxa"/>
-              <w:start w:w="120" w:type="dxa"/>
-              <w:end w:w="120" w:type="dxa"/>
-            </w:tcMar>
           </w:tcPr>
           <w:p>
             <w:pPr>
@@ -2571,12 +2047,6 @@
           <w:tcPr>
             <w:tcW w:type="dxa" w:w="3210"/>
             <w:vAlign w:val="center"/>
-            <w:tcMar>
-              <w:top w:w="80" w:type="dxa"/>
-              <w:bottom w:w="80" w:type="dxa"/>
-              <w:start w:w="120" w:type="dxa"/>
-              <w:end w:w="120" w:type="dxa"/>
-            </w:tcMar>
           </w:tcPr>
           <w:p>
             <w:pPr>
@@ -2942,7 +2412,7 @@
         <w:keepNext/>
       </w:pPr>
       <w:r>
-        <w:t>2:30-3:15 • QuantUI on an H200 GPU</w:t>
+        <w:t>2:30-3:30 • QuantUI on an H200 GPU, and when a GPU is worth it</w:t>
       </w:r>
     </w:p>
     <w:p>
@@ -2959,7 +2429,7 @@
           <w:color w:val="2F3337"/>
           <w:sz w:val="22"/>
         </w:rPr>
-        <w:t>Inspect the SIF's Python 3.11 environment, package manifests, and QuantUI commit.</w:t>
+        <w:t>Inspect the SIF's Python 3.11 environment, package manifests, and QuantUI version.</w:t>
       </w:r>
     </w:p>
     <w:p>
@@ -3015,16 +2485,11 @@
     </w:p>
     <w:p>
       <w:pPr>
-        <w:pStyle w:val="Heading2"/>
-        <w:keepNext/>
-      </w:pPr>
-      <w:r>
-        <w:t>3:15-3:30 • CPU/GPU comparison</w:t>
-      </w:r>
-    </w:p>
-    <w:p>
-      <w:pPr>
-        <w:spacing w:before="0" w:after="120" w:line="300" w:lineRule="auto"/>
+        <w:numPr>
+          <w:ilvl w:val="0"/>
+          <w:numId w:val="10"/>
+        </w:numPr>
+        <w:spacing w:before="0" w:after="80" w:line="300" w:lineRule="auto"/>
       </w:pPr>
       <w:r>
         <w:rPr>
@@ -3032,7 +2497,41 @@
           <w:color w:val="2F3337"/>
           <w:sz w:val="22"/>
         </w:rPr>
-        <w:t>Compare the Slurm files, identify what the shared image does and does not control, and record one resource change before scaling.</w:t>
+        <w:t>Time the same calculation on CPU and GPU across growing basis sets.</w:t>
+      </w:r>
+    </w:p>
+    <w:p>
+      <w:pPr>
+        <w:numPr>
+          <w:ilvl w:val="0"/>
+          <w:numId w:val="10"/>
+        </w:numPr>
+        <w:spacing w:before="0" w:after="80" w:line="300" w:lineRule="auto"/>
+      </w:pPr>
+      <w:r>
+        <w:rPr>
+          <w:rFonts w:ascii="Calibri" w:hAnsi="Calibri"/>
+          <w:color w:val="2F3337"/>
+          <w:sz w:val="22"/>
+        </w:rPr>
+        <w:t>Locate the crossover: overhead dominates small systems, arithmetic wins at scale.</w:t>
+      </w:r>
+    </w:p>
+    <w:p>
+      <w:pPr>
+        <w:numPr>
+          <w:ilvl w:val="0"/>
+          <w:numId w:val="10"/>
+        </w:numPr>
+        <w:spacing w:before="0" w:after="80" w:line="300" w:lineRule="auto"/>
+      </w:pPr>
+      <w:r>
+        <w:rPr>
+          <w:rFonts w:ascii="Calibri" w:hAnsi="Calibri"/>
+          <w:color w:val="2F3337"/>
+          <w:sz w:val="22"/>
+        </w:rPr>
+        <w:t>State why a speedup without its CPU allocation is not a result.</w:t>
       </w:r>
     </w:p>
     <w:p>

</xml_diff>

<commit_message>
Completed the repository-wide coherence pass and single visualization notebook
</commit_message>
<xml_diff>
--- a/agenda/Agenda_Revised.docx
+++ b/agenda/Agenda_Revised.docx
@@ -279,7 +279,7 @@
           <w:color w:val="2F3337"/>
           <w:sz w:val="21"/>
         </w:rPr>
-        <w:t>Active NCShare account; registered SSH public key; laptop with SSH client; course clone; shared course-SIF path; GPU access requested in advance. Pairing is available for participants still waiting for access.</w:t>
+        <w:t>Active NCShare account; laptop; SSH key-based access or browser-based Open OnDemand access; course clone; shared course-SIF path; GPU access requested in advance. Pairing is available for participants still waiting for access.</w:t>
       </w:r>
     </w:p>
     <w:p>
@@ -407,12 +407,20 @@
           <w:color w:val="2F3337"/>
           <w:sz w:val="22"/>
         </w:rPr>
-        <w:t>Reuse the SIF to post-process HDF5 and export an accessible scientific figure.</w:t>
+        <w:t>Reuse the SIF to post-process HDF5 and export accessible, reproducible figures.</w:t>
       </w:r>
     </w:p>
     <w:p>
       <w:r>
         <w:br w:type="page"/>
+      </w:r>
+    </w:p>
+    <w:p>
+      <w:pPr>
+        <w:spacing w:after="200"/>
+      </w:pPr>
+      <w:r>
+        <w:t xml:space="preserve"> </w:t>
       </w:r>
     </w:p>
     <w:p>
@@ -1332,7 +1340,7 @@
                 <w:color w:val="2F3337"/>
                 <w:sz w:val="18"/>
               </w:rPr>
-              <w:t>Post-processed figure and notebook</w:t>
+              <w:t>Four figures and a provenance manifest</w:t>
             </w:r>
           </w:p>
         </w:tc>
@@ -2094,16 +2102,16 @@
       </w:r>
     </w:p>
     <w:p>
+      <w:r>
+        <w:br w:type="page"/>
+      </w:r>
+    </w:p>
+    <w:p>
       <w:pPr>
-        <w:spacing w:before="0" w:after="120" w:line="300" w:lineRule="auto"/>
+        <w:spacing w:after="200"/>
       </w:pPr>
       <w:r>
-        <w:rPr>
-          <w:rFonts w:ascii="Calibri" w:hAnsi="Calibri"/>
-          <w:color w:val="2F3337"/>
-          <w:sz w:val="22"/>
-        </w:rPr>
-        <w:t>Provided: command card, annotated Slurm/container/data workflow, access troubleshooting, and a verified interactive-allocation command.</w:t>
+        <w:t xml:space="preserve"> </w:t>
       </w:r>
     </w:p>
     <w:p>
@@ -2407,6 +2415,33 @@
       </w:r>
     </w:p>
     <w:p>
+      <w:r>
+        <w:br w:type="page"/>
+      </w:r>
+    </w:p>
+    <w:p>
+      <w:pPr>
+        <w:spacing w:after="200"/>
+      </w:pPr>
+      <w:r>
+        <w:t xml:space="preserve"> </w:t>
+      </w:r>
+    </w:p>
+    <w:p>
+      <w:pPr>
+        <w:spacing w:after="80"/>
+      </w:pPr>
+      <w:r>
+        <w:rPr>
+          <w:rFonts w:ascii="Calibri" w:hAnsi="Calibri"/>
+          <w:b/>
+          <w:color w:val="5D6772"/>
+          <w:sz w:val="18"/>
+        </w:rPr>
+        <w:t>SESSION 3 • CONTINUED</w:t>
+      </w:r>
+    </w:p>
+    <w:p>
       <w:pPr>
         <w:pStyle w:val="Heading2"/>
         <w:keepNext/>
@@ -2580,7 +2615,7 @@
           <w:color w:val="2F3337"/>
           <w:sz w:val="22"/>
         </w:rPr>
-        <w:t>3:30-4:30. Launch Jupyter from the same SIF; inspect HDF5 lazily; choose honest color/normalization; run the containerized upstream GRF-to-emissivity converter; and export PNG/PDF figures with image, input, and plot provenance.</w:t>
+        <w:t>3:30-4:30. Launch Jupyter from the same SIF and make four focused figures from inoisy+ and QuantUI outputs. Inspect HDF5 lazily; choose color and normalization from data meaning; compare CPU/GPU timing with an explicit denominator; show ordered scientific change; and export PNG/PDF figures with a provenance manifest. The upstream GRF-to-emissivity converter remains a separate CPU step.</w:t>
       </w:r>
     </w:p>
     <w:p>

</xml_diff>